<commit_message>
Add UX-UI doc and update requirements
Add new Documento de UX-UI.docx and apply changes to LEVANTAMENTO E DOCUMENTAÇÃO DOS REQUISITOS.docx. Both are binary Word files; UX-UI file is newly added and the requirements document has been updated.
</commit_message>
<xml_diff>
--- a/documentação/LEVANTAMENTO E DOCUMENTAÇÃO DOS REQUISITOS.docx
+++ b/documentação/LEVANTAMENTO E DOCUMENTAÇÃO DOS REQUISITOS.docx
@@ -3748,6 +3748,7 @@
     </w:sdt>
     <w:p/>
     <w:p/>
+    <w:p/>
     <w:p>
       <w:pPr>
         <w:sectPr>
@@ -3773,6 +3774,7 @@
           <w:sz w:val="24"/>
           <w:szCs w:val="24"/>
         </w:rPr>
+        <w:lastRenderedPageBreak/>
         <w:t>1. Identificação do módulo</w:t>
       </w:r>
       <w:bookmarkEnd w:id="1"/>
@@ -3822,7 +3824,6 @@
           <w:bCs/>
           <w:sz w:val="24"/>
         </w:rPr>
-        <w:lastRenderedPageBreak/>
         <w:t>Objetivo</w:t>
       </w:r>
       <w:r>
@@ -4253,6 +4254,7 @@
         <w:rPr>
           <w:sz w:val="24"/>
         </w:rPr>
+        <w:lastRenderedPageBreak/>
         <w:t>O módulo também pode apresentar limitações relacionadas à conexão com o banco de dados ou a falhas no sistema, que podem impedir o cadastro ou a consulta das informações. Além disso, o acesso às funcionalidades pode ser limitado de acordo com o nível de permissão de cada usuário. </w:t>
       </w:r>
     </w:p>
@@ -4270,7 +4272,6 @@
           <w:sz w:val="24"/>
           <w:szCs w:val="24"/>
         </w:rPr>
-        <w:lastRenderedPageBreak/>
         <w:t>2. Definição do problema</w:t>
       </w:r>
       <w:bookmarkEnd w:id="2"/>
@@ -4595,6 +4596,7 @@
         <w:rPr>
           <w:sz w:val="24"/>
         </w:rPr>
+        <w:lastRenderedPageBreak/>
         <w:t>A falta de gerenciamento adequado pode causar duplicidade de registros, informações desatualizadas, dificuldade para encontrar dados e aumento de tempo ao realizar consultas. Esses problemas podem gerar trabalho duplicado para funcionários e dificultar atividades no setor de compras, além de aumentar a possibilidade de informações incorretas.</w:t>
       </w:r>
     </w:p>
@@ -4612,7 +4614,6 @@
           <w:bCs/>
           <w:sz w:val="24"/>
         </w:rPr>
-        <w:lastRenderedPageBreak/>
         <w:t>Resolução do problema:</w:t>
       </w:r>
     </w:p>
@@ -4878,6 +4879,7 @@
         <w:rPr>
           <w:sz w:val="24"/>
         </w:rPr>
+        <w:lastRenderedPageBreak/>
         <w:t xml:space="preserve">O Módulo Fornecedor será desenvolvido de forma </w:t>
       </w:r>
       <w:r>
@@ -4947,7 +4949,6 @@
         <w:rPr>
           <w:sz w:val="24"/>
         </w:rPr>
-        <w:lastRenderedPageBreak/>
         <w:t>As informações serão gerenciadas diretamente pelo próprio módulo.</w:t>
       </w:r>
     </w:p>
@@ -5336,6 +5337,7 @@
           <w:bCs/>
           <w:sz w:val="24"/>
         </w:rPr>
+        <w:lastRenderedPageBreak/>
         <w:t>RF03. Edição / Atualização de Dados:</w:t>
       </w:r>
       <w:r>
@@ -5388,7 +5390,6 @@
           <w:bCs/>
           <w:sz w:val="24"/>
         </w:rPr>
-        <w:lastRenderedPageBreak/>
         <w:t>RF05. Remoção / Exclusão de Fornecedores:</w:t>
       </w:r>
       <w:r>
@@ -5807,6 +5808,7 @@
           <w:bCs/>
           <w:sz w:val="24"/>
         </w:rPr>
+        <w:lastRenderedPageBreak/>
         <w:t>Módulo de Autenticação e Controle de Acesso (RBAC):</w:t>
       </w:r>
       <w:r>
@@ -5880,14 +5882,7 @@
         <w:rPr>
           <w:sz w:val="24"/>
         </w:rPr>
-        <w:t xml:space="preserve"> Integração via banco de dados para verificação de vínculos antes de operações de exclusão ou inativação (evitando a exclusão de fornecedores com produtos </w:t>
-      </w:r>
-      <w:r>
-        <w:rPr>
-          <w:sz w:val="24"/>
-        </w:rPr>
-        <w:lastRenderedPageBreak/>
-        <w:t>ativos vinculados) e para disponibilizar a lista de fornecedores para seleção no cadastro de produtos.</w:t>
+        <w:t xml:space="preserve"> Integração via banco de dados para verificação de vínculos antes de operações de exclusão ou inativação (evitando a exclusão de fornecedores com produtos ativos vinculados) e para disponibilizar a lista de fornecedores para seleção no cadastro de produtos.</w:t>
       </w:r>
     </w:p>
     <w:p>
@@ -6290,6 +6285,7 @@
           <w:bCs/>
           <w:sz w:val="24"/>
         </w:rPr>
+        <w:lastRenderedPageBreak/>
         <w:t>Importação/Exportação em Lote:</w:t>
       </w:r>
       <w:r>
@@ -6322,14 +6318,7 @@
         <w:rPr>
           <w:sz w:val="24"/>
         </w:rPr>
-        <w:t xml:space="preserve"> O sistema garantirá a integridade do histórico operacional, mas não terá uma interface </w:t>
-      </w:r>
-      <w:r>
-        <w:rPr>
-          <w:sz w:val="24"/>
-        </w:rPr>
-        <w:lastRenderedPageBreak/>
-        <w:t>de histórico de versão para consultar detalhadamente quem alterou determinado dado individual (</w:t>
+        <w:t xml:space="preserve"> O sistema garantirá a integridade do histórico operacional, mas não terá uma interface de histórico de versão para consultar detalhadamente quem alterou determinado dado individual (</w:t>
       </w:r>
       <w:proofErr w:type="spellStart"/>
       <w:r>
@@ -6609,6 +6598,7 @@
         <w:rPr>
           <w:sz w:val="24"/>
         </w:rPr>
+        <w:lastRenderedPageBreak/>
         <w:t>Usuário envolvido</w:t>
       </w:r>
     </w:p>
@@ -6675,7 +6665,6 @@
           <w:bCs/>
           <w:sz w:val="24"/>
         </w:rPr>
-        <w:lastRenderedPageBreak/>
         <w:t>Funcionalidades levantadas:</w:t>
       </w:r>
     </w:p>
@@ -7068,6 +7057,7 @@
           <w:bCs/>
           <w:sz w:val="24"/>
         </w:rPr>
+        <w:lastRenderedPageBreak/>
         <w:t>Saída:</w:t>
       </w:r>
       <w:r>
@@ -7113,7 +7103,6 @@
           <w:sz w:val="24"/>
           <w:szCs w:val="24"/>
         </w:rPr>
-        <w:lastRenderedPageBreak/>
         <w:t>7. Requisitos não funcionais</w:t>
       </w:r>
       <w:bookmarkEnd w:id="19"/>
@@ -7469,6 +7458,7 @@
         <w:rPr>
           <w:sz w:val="24"/>
         </w:rPr>
+        <w:lastRenderedPageBreak/>
         <w:t>O módulo Fornecedor deverá permitir o cadastro, consulta, alteração, inativação e reativação de fornecedores, respeitando as permissões de acesso. Para o cadastro, será obrigatório informar os dados necessários, incluindo CPF ou CNPJ, que deverá ser único no sistema, além de informações de contato válidas. Os dados deverão ser validados antes da conclusão do cadastro.</w:t>
       </w:r>
     </w:p>
@@ -7483,273 +7473,273 @@
         <w:rPr>
           <w:sz w:val="24"/>
         </w:rPr>
+        <w:t xml:space="preserve">Regras de Negócio </w:t>
+      </w:r>
+      <w:proofErr w:type="gramStart"/>
+      <w:r>
+        <w:rPr>
+          <w:sz w:val="24"/>
+        </w:rPr>
+        <w:t>— .</w:t>
+      </w:r>
+      <w:proofErr w:type="gramEnd"/>
+      <w:r>
+        <w:rPr>
+          <w:sz w:val="24"/>
+        </w:rPr>
+        <w:t xml:space="preserve"> Objetivo Documentar as regras que determinam o funcionamento do módulo Fornecedor, estabelecendo condições, validações, restrições, permissões e comportamentos obrigatórios para o gerenciamento dos fornecedores no SIGE. 2. Regras de Negócio:</w:t>
+      </w:r>
+    </w:p>
+    <w:p>
+      <w:pPr>
+        <w:spacing w:after="160" w:line="278" w:lineRule="auto"/>
+        <w:rPr>
+          <w:sz w:val="24"/>
+        </w:rPr>
+      </w:pPr>
+      <w:r>
+        <w:rPr>
+          <w:sz w:val="24"/>
+        </w:rPr>
+        <w:t xml:space="preserve">RN01 — Cadastro de fornecedor </w:t>
+      </w:r>
+    </w:p>
+    <w:p>
+      <w:pPr>
+        <w:spacing w:after="160" w:line="278" w:lineRule="auto"/>
+        <w:rPr>
+          <w:sz w:val="24"/>
+        </w:rPr>
+      </w:pPr>
+      <w:r>
+        <w:rPr>
+          <w:sz w:val="24"/>
+        </w:rPr>
+        <w:t>O sistema deverá permitir o cadastro de um fornecedor mediante o preenchimento dos dados obrigatórios. </w:t>
+      </w:r>
+    </w:p>
+    <w:p>
+      <w:pPr>
+        <w:spacing w:after="160" w:line="278" w:lineRule="auto"/>
+        <w:rPr>
+          <w:sz w:val="24"/>
+        </w:rPr>
+      </w:pPr>
+      <w:r>
+        <w:rPr>
+          <w:sz w:val="24"/>
+        </w:rPr>
+        <w:t xml:space="preserve">RN02 — Identificação do fornecedor </w:t>
+      </w:r>
+    </w:p>
+    <w:p>
+      <w:pPr>
+        <w:spacing w:after="160" w:line="278" w:lineRule="auto"/>
+        <w:rPr>
+          <w:sz w:val="24"/>
+        </w:rPr>
+      </w:pPr>
+      <w:r>
+        <w:rPr>
+          <w:sz w:val="24"/>
+        </w:rPr>
+        <w:t>O fornecedor deverá possuir CPF ou CNPJ para sua identificação no sistema. </w:t>
+      </w:r>
+    </w:p>
+    <w:p>
+      <w:pPr>
+        <w:spacing w:after="160" w:line="278" w:lineRule="auto"/>
+        <w:rPr>
+          <w:sz w:val="24"/>
+        </w:rPr>
+      </w:pPr>
+      <w:r>
+        <w:rPr>
+          <w:sz w:val="24"/>
+        </w:rPr>
+        <w:t xml:space="preserve">RN03 — Unicidade do documento </w:t>
+      </w:r>
+    </w:p>
+    <w:p>
+      <w:pPr>
+        <w:spacing w:after="160" w:line="278" w:lineRule="auto"/>
+        <w:rPr>
+          <w:sz w:val="24"/>
+        </w:rPr>
+      </w:pPr>
+      <w:r>
+        <w:rPr>
+          <w:sz w:val="24"/>
+        </w:rPr>
+        <w:t>Não será permitido cadastrar mais de um fornecedor utilizando o mesmo CPF ou CNPJ. </w:t>
+      </w:r>
+    </w:p>
+    <w:p>
+      <w:pPr>
+        <w:spacing w:after="160" w:line="278" w:lineRule="auto"/>
+        <w:rPr>
+          <w:sz w:val="24"/>
+        </w:rPr>
+      </w:pPr>
+      <w:r>
+        <w:rPr>
+          <w:sz w:val="24"/>
+        </w:rPr>
+        <w:t xml:space="preserve">RN04 — Validação dos dados </w:t>
+      </w:r>
+    </w:p>
+    <w:p>
+      <w:pPr>
+        <w:spacing w:after="160" w:line="278" w:lineRule="auto"/>
+        <w:rPr>
+          <w:sz w:val="24"/>
+        </w:rPr>
+      </w:pPr>
+      <w:r>
+        <w:rPr>
+          <w:sz w:val="24"/>
+        </w:rPr>
+        <w:t>O sistema deverá validar os dados informados no cadastro antes de concluir a operação. </w:t>
+      </w:r>
+    </w:p>
+    <w:p>
+      <w:pPr>
+        <w:spacing w:after="160" w:line="278" w:lineRule="auto"/>
+        <w:rPr>
+          <w:sz w:val="24"/>
+        </w:rPr>
+      </w:pPr>
+      <w:r>
+        <w:rPr>
+          <w:sz w:val="24"/>
+        </w:rPr>
+        <w:t xml:space="preserve">RN05 — Informações de contato </w:t>
+      </w:r>
+    </w:p>
+    <w:p>
+      <w:pPr>
+        <w:spacing w:after="160" w:line="278" w:lineRule="auto"/>
+        <w:rPr>
+          <w:sz w:val="24"/>
+        </w:rPr>
+      </w:pPr>
+      <w:r>
+        <w:rPr>
+          <w:sz w:val="24"/>
+        </w:rPr>
+        <w:t>O fornecedor deverá possuir informações de contato válidas, como telefone e/ou e-mail, conforme os campos definidos no cadastro. </w:t>
+      </w:r>
+    </w:p>
+    <w:p>
+      <w:pPr>
+        <w:spacing w:after="160" w:line="278" w:lineRule="auto"/>
+        <w:rPr>
+          <w:sz w:val="24"/>
+        </w:rPr>
+      </w:pPr>
+      <w:r>
+        <w:rPr>
+          <w:sz w:val="24"/>
+        </w:rPr>
+        <w:t xml:space="preserve">RN06 — Alteração de fornecedor </w:t>
+      </w:r>
+    </w:p>
+    <w:p>
+      <w:pPr>
+        <w:spacing w:after="160" w:line="278" w:lineRule="auto"/>
+        <w:rPr>
+          <w:sz w:val="24"/>
+        </w:rPr>
+      </w:pPr>
+      <w:r>
+        <w:rPr>
+          <w:sz w:val="24"/>
+        </w:rPr>
+        <w:t>Usuários autorizados poderão alterar os dados cadastrais de um fornecedor. </w:t>
+      </w:r>
+    </w:p>
+    <w:p>
+      <w:pPr>
+        <w:spacing w:after="160" w:line="278" w:lineRule="auto"/>
+        <w:rPr>
+          <w:sz w:val="24"/>
+        </w:rPr>
+      </w:pPr>
+      <w:r>
+        <w:rPr>
+          <w:sz w:val="24"/>
+        </w:rPr>
+        <w:t xml:space="preserve">RN07 — Preservação do histórico </w:t>
+      </w:r>
+    </w:p>
+    <w:p>
+      <w:pPr>
+        <w:spacing w:after="160" w:line="278" w:lineRule="auto"/>
+        <w:rPr>
+          <w:sz w:val="24"/>
+        </w:rPr>
+      </w:pPr>
+      <w:r>
+        <w:rPr>
+          <w:sz w:val="24"/>
+        </w:rPr>
+        <w:t>A alteração dos dados de um fornecedor não deverá apagar ou alterar registros de operações realizadas anteriormente. </w:t>
+      </w:r>
+    </w:p>
+    <w:p>
+      <w:pPr>
+        <w:spacing w:after="160" w:line="278" w:lineRule="auto"/>
+        <w:rPr>
+          <w:sz w:val="24"/>
+        </w:rPr>
+      </w:pPr>
+      <w:r>
+        <w:rPr>
+          <w:sz w:val="24"/>
+        </w:rPr>
+        <w:t xml:space="preserve">RN08 — Exclusão de fornecedor </w:t>
+      </w:r>
+    </w:p>
+    <w:p>
+      <w:pPr>
+        <w:spacing w:after="160" w:line="278" w:lineRule="auto"/>
+        <w:rPr>
+          <w:sz w:val="24"/>
+        </w:rPr>
+      </w:pPr>
+      <w:r>
+        <w:rPr>
+          <w:sz w:val="24"/>
+        </w:rPr>
+        <w:t>Um fornecedor não poderá ser excluído caso possua registros vinculados a produtos ou movimentações no sistema. </w:t>
+      </w:r>
+    </w:p>
+    <w:p>
+      <w:pPr>
+        <w:spacing w:after="160" w:line="278" w:lineRule="auto"/>
+        <w:rPr>
+          <w:sz w:val="24"/>
+        </w:rPr>
+      </w:pPr>
+      <w:r>
+        <w:rPr>
+          <w:sz w:val="24"/>
+        </w:rPr>
+        <w:t xml:space="preserve">RN09 — Inativação de fornecedor </w:t>
+      </w:r>
+    </w:p>
+    <w:p>
+      <w:pPr>
+        <w:spacing w:after="160" w:line="278" w:lineRule="auto"/>
+        <w:rPr>
+          <w:sz w:val="24"/>
+        </w:rPr>
+      </w:pPr>
+      <w:r>
+        <w:rPr>
+          <w:sz w:val="24"/>
+        </w:rPr>
         <w:lastRenderedPageBreak/>
-        <w:t xml:space="preserve">Regras de Negócio </w:t>
-      </w:r>
-      <w:proofErr w:type="gramStart"/>
-      <w:r>
-        <w:rPr>
-          <w:sz w:val="24"/>
-        </w:rPr>
-        <w:t>— .</w:t>
-      </w:r>
-      <w:proofErr w:type="gramEnd"/>
-      <w:r>
-        <w:rPr>
-          <w:sz w:val="24"/>
-        </w:rPr>
-        <w:t xml:space="preserve"> Objetivo Documentar as regras que determinam o funcionamento do módulo Fornecedor, estabelecendo condições, validações, restrições, permissões e comportamentos obrigatórios para o gerenciamento dos fornecedores no SIGE. 2. Regras de Negócio:</w:t>
-      </w:r>
-    </w:p>
-    <w:p>
-      <w:pPr>
-        <w:spacing w:after="160" w:line="278" w:lineRule="auto"/>
-        <w:rPr>
-          <w:sz w:val="24"/>
-        </w:rPr>
-      </w:pPr>
-      <w:r>
-        <w:rPr>
-          <w:sz w:val="24"/>
-        </w:rPr>
-        <w:t xml:space="preserve">RN01 — Cadastro de fornecedor </w:t>
-      </w:r>
-    </w:p>
-    <w:p>
-      <w:pPr>
-        <w:spacing w:after="160" w:line="278" w:lineRule="auto"/>
-        <w:rPr>
-          <w:sz w:val="24"/>
-        </w:rPr>
-      </w:pPr>
-      <w:r>
-        <w:rPr>
-          <w:sz w:val="24"/>
-        </w:rPr>
-        <w:t>O sistema deverá permitir o cadastro de um fornecedor mediante o preenchimento dos dados obrigatórios. </w:t>
-      </w:r>
-    </w:p>
-    <w:p>
-      <w:pPr>
-        <w:spacing w:after="160" w:line="278" w:lineRule="auto"/>
-        <w:rPr>
-          <w:sz w:val="24"/>
-        </w:rPr>
-      </w:pPr>
-      <w:r>
-        <w:rPr>
-          <w:sz w:val="24"/>
-        </w:rPr>
-        <w:t xml:space="preserve">RN02 — Identificação do fornecedor </w:t>
-      </w:r>
-    </w:p>
-    <w:p>
-      <w:pPr>
-        <w:spacing w:after="160" w:line="278" w:lineRule="auto"/>
-        <w:rPr>
-          <w:sz w:val="24"/>
-        </w:rPr>
-      </w:pPr>
-      <w:r>
-        <w:rPr>
-          <w:sz w:val="24"/>
-        </w:rPr>
-        <w:t>O fornecedor deverá possuir CPF ou CNPJ para sua identificação no sistema. </w:t>
-      </w:r>
-    </w:p>
-    <w:p>
-      <w:pPr>
-        <w:spacing w:after="160" w:line="278" w:lineRule="auto"/>
-        <w:rPr>
-          <w:sz w:val="24"/>
-        </w:rPr>
-      </w:pPr>
-      <w:r>
-        <w:rPr>
-          <w:sz w:val="24"/>
-        </w:rPr>
-        <w:t xml:space="preserve">RN03 — Unicidade do documento </w:t>
-      </w:r>
-    </w:p>
-    <w:p>
-      <w:pPr>
-        <w:spacing w:after="160" w:line="278" w:lineRule="auto"/>
-        <w:rPr>
-          <w:sz w:val="24"/>
-        </w:rPr>
-      </w:pPr>
-      <w:r>
-        <w:rPr>
-          <w:sz w:val="24"/>
-        </w:rPr>
-        <w:t>Não será permitido cadastrar mais de um fornecedor utilizando o mesmo CPF ou CNPJ. </w:t>
-      </w:r>
-    </w:p>
-    <w:p>
-      <w:pPr>
-        <w:spacing w:after="160" w:line="278" w:lineRule="auto"/>
-        <w:rPr>
-          <w:sz w:val="24"/>
-        </w:rPr>
-      </w:pPr>
-      <w:r>
-        <w:rPr>
-          <w:sz w:val="24"/>
-        </w:rPr>
-        <w:t xml:space="preserve">RN04 — Validação dos dados </w:t>
-      </w:r>
-    </w:p>
-    <w:p>
-      <w:pPr>
-        <w:spacing w:after="160" w:line="278" w:lineRule="auto"/>
-        <w:rPr>
-          <w:sz w:val="24"/>
-        </w:rPr>
-      </w:pPr>
-      <w:r>
-        <w:rPr>
-          <w:sz w:val="24"/>
-        </w:rPr>
-        <w:t>O sistema deverá validar os dados informados no cadastro antes de concluir a operação. </w:t>
-      </w:r>
-    </w:p>
-    <w:p>
-      <w:pPr>
-        <w:spacing w:after="160" w:line="278" w:lineRule="auto"/>
-        <w:rPr>
-          <w:sz w:val="24"/>
-        </w:rPr>
-      </w:pPr>
-      <w:r>
-        <w:rPr>
-          <w:sz w:val="24"/>
-        </w:rPr>
-        <w:t xml:space="preserve">RN05 — Informações de contato </w:t>
-      </w:r>
-    </w:p>
-    <w:p>
-      <w:pPr>
-        <w:spacing w:after="160" w:line="278" w:lineRule="auto"/>
-        <w:rPr>
-          <w:sz w:val="24"/>
-        </w:rPr>
-      </w:pPr>
-      <w:r>
-        <w:rPr>
-          <w:sz w:val="24"/>
-        </w:rPr>
-        <w:t>O fornecedor deverá possuir informações de contato válidas, como telefone e/ou e-mail, conforme os campos definidos no cadastro. </w:t>
-      </w:r>
-    </w:p>
-    <w:p>
-      <w:pPr>
-        <w:spacing w:after="160" w:line="278" w:lineRule="auto"/>
-        <w:rPr>
-          <w:sz w:val="24"/>
-        </w:rPr>
-      </w:pPr>
-      <w:r>
-        <w:rPr>
-          <w:sz w:val="24"/>
-        </w:rPr>
-        <w:t xml:space="preserve">RN06 — Alteração de fornecedor </w:t>
-      </w:r>
-    </w:p>
-    <w:p>
-      <w:pPr>
-        <w:spacing w:after="160" w:line="278" w:lineRule="auto"/>
-        <w:rPr>
-          <w:sz w:val="24"/>
-        </w:rPr>
-      </w:pPr>
-      <w:r>
-        <w:rPr>
-          <w:sz w:val="24"/>
-        </w:rPr>
-        <w:t>Usuários autorizados poderão alterar os dados cadastrais de um fornecedor. </w:t>
-      </w:r>
-    </w:p>
-    <w:p>
-      <w:pPr>
-        <w:spacing w:after="160" w:line="278" w:lineRule="auto"/>
-        <w:rPr>
-          <w:sz w:val="24"/>
-        </w:rPr>
-      </w:pPr>
-      <w:r>
-        <w:rPr>
-          <w:sz w:val="24"/>
-        </w:rPr>
-        <w:t xml:space="preserve">RN07 — Preservação do histórico </w:t>
-      </w:r>
-    </w:p>
-    <w:p>
-      <w:pPr>
-        <w:spacing w:after="160" w:line="278" w:lineRule="auto"/>
-        <w:rPr>
-          <w:sz w:val="24"/>
-        </w:rPr>
-      </w:pPr>
-      <w:r>
-        <w:rPr>
-          <w:sz w:val="24"/>
-        </w:rPr>
-        <w:t>A alteração dos dados de um fornecedor não deverá apagar ou alterar registros de operações realizadas anteriormente. </w:t>
-      </w:r>
-    </w:p>
-    <w:p>
-      <w:pPr>
-        <w:spacing w:after="160" w:line="278" w:lineRule="auto"/>
-        <w:rPr>
-          <w:sz w:val="24"/>
-        </w:rPr>
-      </w:pPr>
-      <w:r>
-        <w:rPr>
-          <w:sz w:val="24"/>
-        </w:rPr>
-        <w:t xml:space="preserve">RN08 — Exclusão de fornecedor </w:t>
-      </w:r>
-    </w:p>
-    <w:p>
-      <w:pPr>
-        <w:spacing w:after="160" w:line="278" w:lineRule="auto"/>
-        <w:rPr>
-          <w:sz w:val="24"/>
-        </w:rPr>
-      </w:pPr>
-      <w:r>
-        <w:rPr>
-          <w:sz w:val="24"/>
-        </w:rPr>
-        <w:t>Um fornecedor não poderá ser excluído caso possua registros vinculados a produtos ou movimentações no sistema. </w:t>
-      </w:r>
-    </w:p>
-    <w:p>
-      <w:pPr>
-        <w:spacing w:after="160" w:line="278" w:lineRule="auto"/>
-        <w:rPr>
-          <w:sz w:val="24"/>
-        </w:rPr>
-      </w:pPr>
-      <w:r>
-        <w:rPr>
-          <w:sz w:val="24"/>
-        </w:rPr>
-        <w:t xml:space="preserve">RN09 — Inativação de fornecedor </w:t>
-      </w:r>
-    </w:p>
-    <w:p>
-      <w:pPr>
-        <w:spacing w:after="160" w:line="278" w:lineRule="auto"/>
-        <w:rPr>
-          <w:sz w:val="24"/>
-        </w:rPr>
-      </w:pPr>
-      <w:r>
-        <w:rPr>
-          <w:sz w:val="24"/>
-        </w:rPr>
         <w:t>O sistema deverá permitir a inativação de um fornecedor sem apagar seus dados ou histórico. </w:t>
       </w:r>
     </w:p>
@@ -7778,7 +7768,6 @@
         <w:rPr>
           <w:sz w:val="24"/>
         </w:rPr>
-        <w:lastRenderedPageBreak/>
         <w:t>Um fornecedor inativo não poderá ser utilizado em novas operações que exijam um fornecedor ativo. </w:t>
       </w:r>
     </w:p>

</xml_diff>